<commit_message>
add final project pdf and docs
</commit_message>
<xml_diff>
--- a/SAARC_Financial_Worries_Project_Final.docx
+++ b/SAARC_Financial_Worries_Project_Final.docx
@@ -1070,7 +1070,7 @@
         <w:rPr>
           <w:rFonts w:ascii="Times New Roman" w:hAnsi="Times New Roman"/>
         </w:rPr>
-        <w:t xml:space="preserve"> (Exam Roll No: 20204006, Registration No: 20204006), M.S. Program in Statistics, Session 2023-2024, Department of Statistics, University of Chittagong, has been carried out under my direct supervision.</w:t>
+        <w:t xml:space="preserve"> (Exam Roll No: 20204006, Registration No: 20204006), M.S. in Statistics, Session 2023-2024, Department of Statistics, University of Chittagong, has been carried out under my direct supervision.</w:t>
       </w:r>
     </w:p>
     <w:p>
@@ -2034,6 +2034,13 @@
             </w:rPr>
             <w:fldChar w:fldCharType="separate"/>
           </w:r>
+          <w:r>
+            <w:rPr>
+              <w:rStyle w:val="IndexLink"/>
+              <w:rFonts w:ascii="Times New Roman" w:hAnsi="Times New Roman"/>
+            </w:rPr>
+            <w:t xml:space="preserve">1. </w:t>
+          </w:r>
           <w:hyperlink w:anchor="__RefHeading___Toc3865_3420426130">
             <w:r>
               <w:rPr>
@@ -3176,13 +3183,19 @@
             </w:tabs>
             <w:rPr/>
           </w:pPr>
+          <w:r>
+            <w:rPr>
+              <w:rFonts w:ascii="Times New Roman" w:hAnsi="Times New Roman"/>
+            </w:rPr>
+            <w:t>A</w:t>
+          </w:r>
           <w:hyperlink w:anchor="__RefHeading___Toc3973_3420426130">
             <w:r>
               <w:rPr>
                 <w:rStyle w:val="IndexLink"/>
                 <w:rFonts w:ascii="Times New Roman" w:hAnsi="Times New Roman"/>
               </w:rPr>
-              <w:t>A.3 Exploratory Data Analysis (incl. Country and Age) (01_eda.py)</w:t>
+              <w:t>.3 Exploratory Data Analysis (incl. Country and Age) (01_eda.py)</w:t>
               <w:tab/>
               <w:t>3</w:t>
             </w:r>
@@ -45339,15 +45352,15 @@
       <w:u w:val="single"/>
     </w:rPr>
   </w:style>
-  <w:style w:type="character" w:styleId="FootnoteCharactersuser">
-    <w:name w:val="Footnote Characters (user)"/>
+  <w:style w:type="character" w:styleId="FootnoteCharacters">
+    <w:name w:val="Footnote Characters"/>
     <w:qFormat/>
     <w:rPr>
       <w:vertAlign w:val="superscript"/>
     </w:rPr>
   </w:style>
-  <w:style w:type="character" w:styleId="FootnoteCharacters">
-    <w:name w:val="Footnote Characters"/>
+  <w:style w:type="character" w:styleId="FootnoteCharactersuser">
+    <w:name w:val="Footnote Characters (user)"/>
     <w:qFormat/>
     <w:rPr>
       <w:vertAlign w:val="superscript"/>
@@ -45371,15 +45384,15 @@
       <w:szCs w:val="20"/>
     </w:rPr>
   </w:style>
-  <w:style w:type="character" w:styleId="EndnoteCharactersuser">
-    <w:name w:val="Endnote Characters (user)"/>
+  <w:style w:type="character" w:styleId="EndnoteCharacters">
+    <w:name w:val="Endnote Characters"/>
     <w:qFormat/>
     <w:rPr>
       <w:vertAlign w:val="superscript"/>
     </w:rPr>
   </w:style>
-  <w:style w:type="character" w:styleId="EndnoteCharacters">
-    <w:name w:val="Endnote Characters"/>
+  <w:style w:type="character" w:styleId="EndnoteCharactersuser">
+    <w:name w:val="Endnote Characters (user)"/>
     <w:qFormat/>
     <w:rPr>
       <w:vertAlign w:val="superscript"/>
@@ -45451,8 +45464,8 @@
       <w:rFonts w:ascii="Liberation Mono" w:hAnsi="Liberation Mono" w:eastAsia="NSimSun" w:cs="Liberation Mono"/>
     </w:rPr>
   </w:style>
-  <w:style w:type="character" w:styleId="CaptionCharactersuser">
-    <w:name w:val="Caption Characters (user)"/>
+  <w:style w:type="character" w:styleId="CaptionCharacters">
+    <w:name w:val="Caption Characters"/>
     <w:qFormat/>
     <w:rPr/>
   </w:style>
@@ -45487,8 +45500,8 @@
     <w:name w:val="page number"/>
     <w:rPr/>
   </w:style>
-  <w:style w:type="character" w:styleId="MainIndexEntryuser">
-    <w:name w:val="Main Index Entry (user)"/>
+  <w:style w:type="character" w:styleId="MainIndexEntry">
+    <w:name w:val="Main Index Entry"/>
     <w:qFormat/>
     <w:rPr>
       <w:b/>
@@ -45506,8 +45519,8 @@
     <w:name w:val="line number"/>
     <w:rPr/>
   </w:style>
-  <w:style w:type="character" w:styleId="Bulletsuser">
-    <w:name w:val="Bullets (user)"/>
+  <w:style w:type="character" w:styleId="Bullets">
+    <w:name w:val="Bullets"/>
     <w:qFormat/>
     <w:rPr>
       <w:rFonts w:ascii="OpenSymbol" w:hAnsi="OpenSymbol" w:eastAsia="OpenSymbol" w:cs="OpenSymbol"/>
@@ -45518,8 +45531,8 @@
     <w:qFormat/>
     <w:rPr/>
   </w:style>
-  <w:style w:type="character" w:styleId="Bullets">
-    <w:name w:val="Bullets"/>
+  <w:style w:type="character" w:styleId="Bulletsuser">
+    <w:name w:val="Bullets (user)"/>
     <w:qFormat/>
     <w:rPr>
       <w:rFonts w:ascii="OpenSymbol" w:hAnsi="OpenSymbol" w:eastAsia="OpenSymbol" w:cs="OpenSymbol"/>
@@ -45871,8 +45884,8 @@
     </w:pPr>
     <w:rPr/>
   </w:style>
-  <w:style w:type="paragraph" w:styleId="FrameContentsuser">
-    <w:name w:val="Frame Contents (user)"/>
+  <w:style w:type="paragraph" w:styleId="FrameContents">
+    <w:name w:val="Frame Contents"/>
     <w:basedOn w:val="Normal"/>
     <w:qFormat/>
     <w:pPr/>
@@ -45965,8 +45978,8 @@
       <w:szCs w:val="32"/>
     </w:rPr>
   </w:style>
-  <w:style w:type="paragraph" w:styleId="ObjectIndexHeadinguser">
-    <w:name w:val="Object Index Heading (user)"/>
+  <w:style w:type="paragraph" w:styleId="ObjectIndexHeading">
+    <w:name w:val="Object Index Heading"/>
     <w:basedOn w:val="IndexHeading"/>
     <w:qFormat/>
     <w:pPr>
@@ -45980,8 +45993,8 @@
       <w:szCs w:val="32"/>
     </w:rPr>
   </w:style>
-  <w:style w:type="paragraph" w:styleId="TableIndexHeadinguser">
-    <w:name w:val="Table Index Heading (user)"/>
+  <w:style w:type="paragraph" w:styleId="TableIndexHeading">
+    <w:name w:val="Table Index Heading"/>
     <w:basedOn w:val="IndexHeading"/>
     <w:qFormat/>
     <w:pPr>
@@ -46023,8 +46036,8 @@
     <w:pPr/>
     <w:rPr/>
   </w:style>
-  <w:style w:type="paragraph" w:styleId="HeaderLeftuser">
-    <w:name w:val="Header Left (user)"/>
+  <w:style w:type="paragraph" w:styleId="HeaderLeft">
+    <w:name w:val="Header Left"/>
     <w:basedOn w:val="Header"/>
     <w:qFormat/>
     <w:pPr>
@@ -46038,8 +46051,8 @@
     </w:pPr>
     <w:rPr/>
   </w:style>
-  <w:style w:type="paragraph" w:styleId="HeaderRightuser">
-    <w:name w:val="Header Right (user)"/>
+  <w:style w:type="paragraph" w:styleId="HeaderRight">
+    <w:name w:val="Header Right"/>
     <w:basedOn w:val="Header"/>
     <w:qFormat/>
     <w:pPr>
@@ -46053,8 +46066,8 @@
     </w:pPr>
     <w:rPr/>
   </w:style>
-  <w:style w:type="paragraph" w:styleId="FooterRightuser">
-    <w:name w:val="Footer Right (user)"/>
+  <w:style w:type="paragraph" w:styleId="FooterRight">
+    <w:name w:val="Footer Right"/>
     <w:basedOn w:val="Footer"/>
     <w:qFormat/>
     <w:pPr>
@@ -46068,8 +46081,8 @@
     </w:pPr>
     <w:rPr/>
   </w:style>
-  <w:style w:type="paragraph" w:styleId="FooterLeftuser">
-    <w:name w:val="Footer Left (user)"/>
+  <w:style w:type="paragraph" w:styleId="FooterLeft">
+    <w:name w:val="Footer Left"/>
     <w:basedOn w:val="Footer"/>
     <w:qFormat/>
     <w:pPr>
@@ -46090,8 +46103,8 @@
     <w:pPr/>
     <w:rPr/>
   </w:style>
-  <w:style w:type="paragraph" w:styleId="TableIndex1user">
-    <w:name w:val="Table Index 1 (user)"/>
+  <w:style w:type="paragraph" w:styleId="TableIndex1">
+    <w:name w:val="Table Index 1"/>
     <w:basedOn w:val="Index"/>
     <w:qFormat/>
     <w:pPr>
@@ -46343,8 +46356,8 @@
     </w:pPr>
     <w:rPr/>
   </w:style>
-  <w:style w:type="paragraph" w:styleId="ObjectIndex1user">
-    <w:name w:val="Object Index 1 (user)"/>
+  <w:style w:type="paragraph" w:styleId="ObjectIndex1">
+    <w:name w:val="Object Index 1"/>
     <w:basedOn w:val="Index"/>
     <w:qFormat/>
     <w:pPr>
@@ -46835,8 +46848,8 @@
     </w:pPr>
     <w:rPr/>
   </w:style>
-  <w:style w:type="paragraph" w:styleId="HangingIndentuser">
-    <w:name w:val="Hanging Indent (user)"/>
+  <w:style w:type="paragraph" w:styleId="HangingIndent">
+    <w:name w:val="Hanging Indent"/>
     <w:basedOn w:val="BodyText"/>
     <w:qFormat/>
     <w:pPr>

</xml_diff>

<commit_message>
fix: fix the grammatical mistake at the last page of the docx
</commit_message>
<xml_diff>
--- a/SAARC_Financial_Worries_Project_Final.docx
+++ b/SAARC_Financial_Worries_Project_Final.docx
@@ -22020,19 +22020,7 @@
         <w:rPr>
           <w:rFonts w:ascii="Times New Roman" w:hAnsi="Times New Roman"/>
         </w:rPr>
-        <w:t>Figure 1</w:t>
-      </w:r>
-      <w:r>
-        <w:rPr>
-          <w:rFonts w:ascii="Times New Roman" w:hAnsi="Times New Roman"/>
-        </w:rPr>
-        <w:t>1</w:t>
-      </w:r>
-      <w:r>
-        <w:rPr>
-          <w:rFonts w:ascii="Times New Roman" w:hAnsi="Times New Roman"/>
-        </w:rPr>
-        <w:t xml:space="preserve"> presents class-specific SHAP beeswarm plots for the four substantively largest categories. Each point is one test-set respondent; horizontal position shows the SHAP value (impact on that outcome's predicted log-odds), and color shows the underlying feature value (red = high, blue = low).</w:t>
+        <w:t>Figure 11 presents class-specific SHAP beeswarm plots for the four substantively largest categories. Each point is one test-set respondent; horizontal position shows the SHAP value (impact on that outcome's predicted log-odds), and color shows the underlying feature value (red = high, blue = low).</w:t>
       </w:r>
     </w:p>
     <w:p>
@@ -40787,7 +40775,178 @@
           <w:szCs w:val="32"/>
           <w:u w:val="none"/>
         </w:rPr>
-        <w:t>End of Project</w:t>
+      </w:r>
+    </w:p>
+    <w:p>
+      <w:pPr>
+        <w:pStyle w:val="Normal"/>
+        <w:spacing w:before="0" w:after="15"/>
+        <w:jc w:val="center"/>
+        <w:rPr>
+          <w:rFonts w:ascii="Times New Roman" w:hAnsi="Times New Roman"/>
+        </w:rPr>
+      </w:pPr>
+      <w:r>
+        <w:rPr>
+          <w:rFonts w:ascii="Times New Roman" w:hAnsi="Times New Roman"/>
+          <w:b/>
+          <w:bCs/>
+          <w:i w:val="false"/>
+          <w:iCs w:val="false"/>
+          <w:color w:val="213965"/>
+          <w:sz w:val="32"/>
+          <w:szCs w:val="32"/>
+          <w:u w:val="none"/>
+        </w:rPr>
+      </w:r>
+    </w:p>
+    <w:p>
+      <w:pPr>
+        <w:pStyle w:val="Normal"/>
+        <w:spacing w:before="0" w:after="15"/>
+        <w:jc w:val="center"/>
+        <w:rPr>
+          <w:rFonts w:ascii="Times New Roman" w:hAnsi="Times New Roman"/>
+        </w:rPr>
+      </w:pPr>
+      <w:r>
+        <w:rPr>
+          <w:rFonts w:ascii="Times New Roman" w:hAnsi="Times New Roman"/>
+          <w:b/>
+          <w:bCs/>
+          <w:i w:val="false"/>
+          <w:iCs w:val="false"/>
+          <w:color w:val="213965"/>
+          <w:sz w:val="32"/>
+          <w:szCs w:val="32"/>
+          <w:u w:val="none"/>
+        </w:rPr>
+      </w:r>
+    </w:p>
+    <w:p>
+      <w:pPr>
+        <w:pStyle w:val="Normal"/>
+        <w:spacing w:before="0" w:after="15"/>
+        <w:jc w:val="center"/>
+        <w:rPr>
+          <w:rFonts w:ascii="Times New Roman" w:hAnsi="Times New Roman"/>
+        </w:rPr>
+      </w:pPr>
+      <w:r>
+        <w:rPr>
+          <w:rFonts w:ascii="Times New Roman" w:hAnsi="Times New Roman"/>
+          <w:b/>
+          <w:bCs/>
+          <w:i w:val="false"/>
+          <w:iCs w:val="false"/>
+          <w:color w:val="213965"/>
+          <w:sz w:val="32"/>
+          <w:szCs w:val="32"/>
+          <w:u w:val="none"/>
+        </w:rPr>
+      </w:r>
+    </w:p>
+    <w:p>
+      <w:pPr>
+        <w:pStyle w:val="Normal"/>
+        <w:spacing w:before="0" w:after="15"/>
+        <w:jc w:val="center"/>
+        <w:rPr>
+          <w:rFonts w:ascii="Times New Roman" w:hAnsi="Times New Roman"/>
+        </w:rPr>
+      </w:pPr>
+      <w:r>
+        <w:rPr>
+          <w:rFonts w:ascii="Times New Roman" w:hAnsi="Times New Roman"/>
+          <w:b/>
+          <w:bCs/>
+          <w:i w:val="false"/>
+          <w:iCs w:val="false"/>
+          <w:color w:val="213965"/>
+          <w:sz w:val="32"/>
+          <w:szCs w:val="32"/>
+          <w:u w:val="none"/>
+        </w:rPr>
+      </w:r>
+    </w:p>
+    <w:p>
+      <w:pPr>
+        <w:pStyle w:val="Normal"/>
+        <w:spacing w:before="0" w:after="15"/>
+        <w:jc w:val="center"/>
+        <w:rPr>
+          <w:rFonts w:ascii="Times New Roman" w:hAnsi="Times New Roman"/>
+        </w:rPr>
+      </w:pPr>
+      <w:r>
+        <w:rPr>
+          <w:rFonts w:ascii="Times New Roman" w:hAnsi="Times New Roman"/>
+          <w:b/>
+          <w:bCs/>
+          <w:i w:val="false"/>
+          <w:iCs w:val="false"/>
+          <w:color w:val="213965"/>
+          <w:sz w:val="32"/>
+          <w:szCs w:val="32"/>
+          <w:u w:val="none"/>
+        </w:rPr>
+        <w:t xml:space="preserve">End of </w:t>
+      </w:r>
+      <w:r>
+        <w:rPr>
+          <w:rFonts w:ascii="Times New Roman" w:hAnsi="Times New Roman"/>
+          <w:b/>
+          <w:bCs/>
+          <w:i w:val="false"/>
+          <w:iCs w:val="false"/>
+          <w:color w:val="213965"/>
+          <w:sz w:val="32"/>
+          <w:szCs w:val="32"/>
+          <w:u w:val="none"/>
+        </w:rPr>
+        <w:t>T</w:t>
+      </w:r>
+      <w:r>
+        <w:rPr>
+          <w:rFonts w:ascii="Times New Roman" w:hAnsi="Times New Roman"/>
+          <w:b/>
+          <w:bCs/>
+          <w:i w:val="false"/>
+          <w:iCs w:val="false"/>
+          <w:color w:val="213965"/>
+          <w:sz w:val="32"/>
+          <w:szCs w:val="32"/>
+          <w:u w:val="none"/>
+        </w:rPr>
+        <w:t>h</w:t>
+      </w:r>
+      <w:r>
+        <w:rPr>
+          <w:rFonts w:ascii="Times New Roman" w:hAnsi="Times New Roman"/>
+          <w:b/>
+          <w:bCs/>
+          <w:i w:val="false"/>
+          <w:iCs w:val="false"/>
+          <w:color w:val="213965"/>
+          <w:sz w:val="32"/>
+          <w:szCs w:val="32"/>
+          <w:u w:val="none"/>
+        </w:rPr>
+        <w:t xml:space="preserve">e </w:t>
+      </w:r>
+      <w:r>
+        <w:rPr>
+          <w:rFonts w:ascii="Times New Roman" w:hAnsi="Times New Roman"/>
+          <w:b/>
+          <w:bCs/>
+          <w:i w:val="false"/>
+          <w:iCs w:val="false"/>
+          <w:color w:val="213965"/>
+          <w:sz w:val="32"/>
+          <w:szCs w:val="32"/>
+          <w:u w:val="none"/>
+        </w:rPr>
+        <w:t>Project</w:t>
       </w:r>
     </w:p>
     <w:p>
@@ -42424,15 +42583,15 @@
       <w:u w:val="single"/>
     </w:rPr>
   </w:style>
-  <w:style w:type="character" w:styleId="FootnoteCharactersuser">
-    <w:name w:val="Footnote Characters (user)"/>
+  <w:style w:type="character" w:styleId="FootnoteCharacters">
+    <w:name w:val="Footnote Characters"/>
     <w:qFormat/>
     <w:rPr>
       <w:vertAlign w:val="superscript"/>
     </w:rPr>
   </w:style>
-  <w:style w:type="character" w:styleId="FootnoteCharacters">
-    <w:name w:val="Footnote Characters"/>
+  <w:style w:type="character" w:styleId="FootnoteCharactersuser">
+    <w:name w:val="Footnote Characters (user)"/>
     <w:qFormat/>
     <w:rPr>
       <w:vertAlign w:val="superscript"/>
@@ -42456,15 +42615,15 @@
       <w:szCs w:val="20"/>
     </w:rPr>
   </w:style>
-  <w:style w:type="character" w:styleId="EndnoteCharactersuser">
-    <w:name w:val="Endnote Characters (user)"/>
+  <w:style w:type="character" w:styleId="EndnoteCharacters">
+    <w:name w:val="Endnote Characters"/>
     <w:qFormat/>
     <w:rPr>
       <w:vertAlign w:val="superscript"/>
     </w:rPr>
   </w:style>
-  <w:style w:type="character" w:styleId="EndnoteCharacters">
-    <w:name w:val="Endnote Characters"/>
+  <w:style w:type="character" w:styleId="EndnoteCharactersuser">
+    <w:name w:val="Endnote Characters (user)"/>
     <w:qFormat/>
     <w:rPr>
       <w:vertAlign w:val="superscript"/>
@@ -42536,8 +42695,8 @@
       <w:rFonts w:ascii="Liberation Mono" w:hAnsi="Liberation Mono" w:eastAsia="NSimSun" w:cs="Liberation Mono"/>
     </w:rPr>
   </w:style>
-  <w:style w:type="character" w:styleId="CaptionCharactersuser">
-    <w:name w:val="Caption Characters (user)"/>
+  <w:style w:type="character" w:styleId="CaptionCharacters">
+    <w:name w:val="Caption Characters"/>
     <w:qFormat/>
     <w:rPr/>
   </w:style>
@@ -42572,8 +42731,8 @@
     <w:name w:val="page number"/>
     <w:rPr/>
   </w:style>
-  <w:style w:type="character" w:styleId="MainIndexEntryuser">
-    <w:name w:val="Main Index Entry (user)"/>
+  <w:style w:type="character" w:styleId="MainIndexEntry">
+    <w:name w:val="Main Index Entry"/>
     <w:qFormat/>
     <w:rPr>
       <w:b/>
@@ -42591,8 +42750,8 @@
     <w:name w:val="line number"/>
     <w:rPr/>
   </w:style>
-  <w:style w:type="character" w:styleId="Bulletsuser">
-    <w:name w:val="Bullets (user)"/>
+  <w:style w:type="character" w:styleId="Bullets">
+    <w:name w:val="Bullets"/>
     <w:qFormat/>
     <w:rPr>
       <w:rFonts w:ascii="OpenSymbol" w:hAnsi="OpenSymbol" w:eastAsia="OpenSymbol" w:cs="OpenSymbol"/>
@@ -42603,8 +42762,8 @@
     <w:qFormat/>
     <w:rPr/>
   </w:style>
-  <w:style w:type="character" w:styleId="Bullets">
-    <w:name w:val="Bullets"/>
+  <w:style w:type="character" w:styleId="Bulletsuser">
+    <w:name w:val="Bullets (user)"/>
     <w:qFormat/>
     <w:rPr>
       <w:rFonts w:ascii="OpenSymbol" w:hAnsi="OpenSymbol" w:eastAsia="OpenSymbol" w:cs="OpenSymbol"/>
@@ -42956,8 +43115,8 @@
     </w:pPr>
     <w:rPr/>
   </w:style>
-  <w:style w:type="paragraph" w:styleId="FrameContentsuser">
-    <w:name w:val="Frame Contents (user)"/>
+  <w:style w:type="paragraph" w:styleId="FrameContents">
+    <w:name w:val="Frame Contents"/>
     <w:basedOn w:val="Normal"/>
     <w:qFormat/>
     <w:pPr/>
@@ -43050,8 +43209,8 @@
       <w:szCs w:val="32"/>
     </w:rPr>
   </w:style>
-  <w:style w:type="paragraph" w:styleId="ObjectIndexHeadinguser">
-    <w:name w:val="Object Index Heading (user)"/>
+  <w:style w:type="paragraph" w:styleId="ObjectIndexHeading">
+    <w:name w:val="Object Index Heading"/>
     <w:basedOn w:val="IndexHeading"/>
     <w:qFormat/>
     <w:pPr>
@@ -43065,8 +43224,8 @@
       <w:szCs w:val="32"/>
     </w:rPr>
   </w:style>
-  <w:style w:type="paragraph" w:styleId="TableIndexHeadinguser">
-    <w:name w:val="Table Index Heading (user)"/>
+  <w:style w:type="paragraph" w:styleId="TableIndexHeading">
+    <w:name w:val="Table Index Heading"/>
     <w:basedOn w:val="IndexHeading"/>
     <w:qFormat/>
     <w:pPr>
@@ -43108,8 +43267,8 @@
     <w:pPr/>
     <w:rPr/>
   </w:style>
-  <w:style w:type="paragraph" w:styleId="HeaderLeftuser">
-    <w:name w:val="Header Left (user)"/>
+  <w:style w:type="paragraph" w:styleId="HeaderLeft">
+    <w:name w:val="Header Left"/>
     <w:basedOn w:val="Header"/>
     <w:qFormat/>
     <w:pPr>
@@ -43123,8 +43282,8 @@
     </w:pPr>
     <w:rPr/>
   </w:style>
-  <w:style w:type="paragraph" w:styleId="HeaderRightuser">
-    <w:name w:val="Header Right (user)"/>
+  <w:style w:type="paragraph" w:styleId="HeaderRight">
+    <w:name w:val="Header Right"/>
     <w:basedOn w:val="Header"/>
     <w:qFormat/>
     <w:pPr>
@@ -43138,8 +43297,8 @@
     </w:pPr>
     <w:rPr/>
   </w:style>
-  <w:style w:type="paragraph" w:styleId="FooterRightuser">
-    <w:name w:val="Footer Right (user)"/>
+  <w:style w:type="paragraph" w:styleId="FooterRight">
+    <w:name w:val="Footer Right"/>
     <w:basedOn w:val="Footer"/>
     <w:qFormat/>
     <w:pPr>
@@ -43153,8 +43312,8 @@
     </w:pPr>
     <w:rPr/>
   </w:style>
-  <w:style w:type="paragraph" w:styleId="FooterLeftuser">
-    <w:name w:val="Footer Left (user)"/>
+  <w:style w:type="paragraph" w:styleId="FooterLeft">
+    <w:name w:val="Footer Left"/>
     <w:basedOn w:val="Footer"/>
     <w:qFormat/>
     <w:pPr>
@@ -43175,8 +43334,8 @@
     <w:pPr/>
     <w:rPr/>
   </w:style>
-  <w:style w:type="paragraph" w:styleId="TableIndex1user">
-    <w:name w:val="Table Index 1 (user)"/>
+  <w:style w:type="paragraph" w:styleId="TableIndex1">
+    <w:name w:val="Table Index 1"/>
     <w:basedOn w:val="Index"/>
     <w:qFormat/>
     <w:pPr>
@@ -43428,8 +43587,8 @@
     </w:pPr>
     <w:rPr/>
   </w:style>
-  <w:style w:type="paragraph" w:styleId="ObjectIndex1user">
-    <w:name w:val="Object Index 1 (user)"/>
+  <w:style w:type="paragraph" w:styleId="ObjectIndex1">
+    <w:name w:val="Object Index 1"/>
     <w:basedOn w:val="Index"/>
     <w:qFormat/>
     <w:pPr>
@@ -43920,8 +44079,8 @@
     </w:pPr>
     <w:rPr/>
   </w:style>
-  <w:style w:type="paragraph" w:styleId="HangingIndentuser">
-    <w:name w:val="Hanging Indent (user)"/>
+  <w:style w:type="paragraph" w:styleId="HangingIndent">
+    <w:name w:val="Hanging Indent"/>
     <w:basedOn w:val="BodyText"/>
     <w:qFormat/>
     <w:pPr>

</xml_diff>

<commit_message>
fix: remove Mr. from supervisor name
</commit_message>
<xml_diff>
--- a/SAARC_Financial_Worries_Project_Final.docx
+++ b/SAARC_Financial_Worries_Project_Final.docx
@@ -486,7 +486,7 @@
                 <w:sz w:val="21"/>
                 <w:szCs w:val="21"/>
               </w:rPr>
-              <w:t>Professor Mr. Md. Monirul Islam</w:t>
+              <w:t>Professor Md. Monirul Islam</w:t>
             </w:r>
           </w:p>
           <w:p>
@@ -769,7 +769,7 @@
           <w:b/>
           <w:bCs/>
         </w:rPr>
-        <w:t>Professor Mr. Md. Monirul Islam</w:t>
+        <w:t>Professor Md. Monirul Islam</w:t>
       </w:r>
       <w:r>
         <w:rPr>
@@ -1150,7 +1150,7 @@
           <w:b/>
           <w:bCs/>
         </w:rPr>
-        <w:t>Professor Mr. Md. Monirul Islam</w:t>
+        <w:t>Professor Md. Monirul Islam</w:t>
       </w:r>
     </w:p>
     <w:p>
@@ -1249,7 +1249,7 @@
         <w:rPr>
           <w:rFonts w:ascii="Times New Roman" w:hAnsi="Times New Roman"/>
         </w:rPr>
-        <w:t xml:space="preserve"> is based on my own original work carried out under the supervision of Professor Mr. Md. Monirul Islam, Department of Statistics, University of Chittagong, in partial fulfillment of the requirements for the degree of Master of Science (M.S.) in Statistics.</w:t>
+        <w:t xml:space="preserve"> is based on my own original work carried out under the supervision of Professor Md. Monirul Islam, Department of Statistics, University of Chittagong, in partial fulfillment of the requirements for the degree of Master of Science (M.S.) in Statistics.</w:t>
       </w:r>
     </w:p>
     <w:p>
@@ -1459,7 +1459,7 @@
           <w:sz w:val="22"/>
           <w:szCs w:val="22"/>
         </w:rPr>
-        <w:t>Mr. Md. Monirul Islam, Professor, Department of Statistics, University of Chittagong</w:t>
+        <w:t>Md. Monirul Islam, Professor, Department of Statistics, University of Chittagong</w:t>
       </w:r>
       <w:r>
         <w:rPr>
@@ -40766,6 +40766,81 @@
       <w:r>
         <w:rPr>
           <w:rFonts w:ascii="Times New Roman" w:hAnsi="Times New Roman"/>
+        </w:rPr>
+      </w:r>
+    </w:p>
+    <w:p>
+      <w:pPr>
+        <w:pStyle w:val="Normal"/>
+        <w:spacing w:before="0" w:after="15"/>
+        <w:jc w:val="center"/>
+        <w:rPr>
+          <w:rFonts w:ascii="Times New Roman" w:hAnsi="Times New Roman"/>
+        </w:rPr>
+      </w:pPr>
+      <w:r>
+        <w:rPr>
+          <w:rFonts w:ascii="Times New Roman" w:hAnsi="Times New Roman"/>
+        </w:rPr>
+      </w:r>
+    </w:p>
+    <w:p>
+      <w:pPr>
+        <w:pStyle w:val="Normal"/>
+        <w:spacing w:before="0" w:after="15"/>
+        <w:jc w:val="center"/>
+        <w:rPr>
+          <w:rFonts w:ascii="Times New Roman" w:hAnsi="Times New Roman"/>
+        </w:rPr>
+      </w:pPr>
+      <w:r>
+        <w:rPr>
+          <w:rFonts w:ascii="Times New Roman" w:hAnsi="Times New Roman"/>
+        </w:rPr>
+      </w:r>
+    </w:p>
+    <w:p>
+      <w:pPr>
+        <w:pStyle w:val="Normal"/>
+        <w:spacing w:before="0" w:after="15"/>
+        <w:jc w:val="center"/>
+        <w:rPr>
+          <w:rFonts w:ascii="Times New Roman" w:hAnsi="Times New Roman"/>
+        </w:rPr>
+      </w:pPr>
+      <w:r>
+        <w:rPr>
+          <w:rFonts w:ascii="Times New Roman" w:hAnsi="Times New Roman"/>
+        </w:rPr>
+      </w:r>
+    </w:p>
+    <w:p>
+      <w:pPr>
+        <w:pStyle w:val="Normal"/>
+        <w:spacing w:before="0" w:after="15"/>
+        <w:jc w:val="center"/>
+        <w:rPr>
+          <w:rFonts w:ascii="Times New Roman" w:hAnsi="Times New Roman"/>
+        </w:rPr>
+      </w:pPr>
+      <w:r>
+        <w:rPr>
+          <w:rFonts w:ascii="Times New Roman" w:hAnsi="Times New Roman"/>
+        </w:rPr>
+      </w:r>
+    </w:p>
+    <w:p>
+      <w:pPr>
+        <w:pStyle w:val="Normal"/>
+        <w:spacing w:before="0" w:after="15"/>
+        <w:jc w:val="center"/>
+        <w:rPr>
+          <w:rFonts w:ascii="Times New Roman" w:hAnsi="Times New Roman"/>
+        </w:rPr>
+      </w:pPr>
+      <w:r>
+        <w:rPr>
+          <w:rFonts w:ascii="Times New Roman" w:hAnsi="Times New Roman"/>
           <w:b/>
           <w:bCs/>
           <w:i w:val="false"/>
@@ -40775,178 +40850,7 @@
           <w:szCs w:val="32"/>
           <w:u w:val="none"/>
         </w:rPr>
-      </w:r>
-    </w:p>
-    <w:p>
-      <w:pPr>
-        <w:pStyle w:val="Normal"/>
-        <w:spacing w:before="0" w:after="15"/>
-        <w:jc w:val="center"/>
-        <w:rPr>
-          <w:rFonts w:ascii="Times New Roman" w:hAnsi="Times New Roman"/>
-        </w:rPr>
-      </w:pPr>
-      <w:r>
-        <w:rPr>
-          <w:rFonts w:ascii="Times New Roman" w:hAnsi="Times New Roman"/>
-          <w:b/>
-          <w:bCs/>
-          <w:i w:val="false"/>
-          <w:iCs w:val="false"/>
-          <w:color w:val="213965"/>
-          <w:sz w:val="32"/>
-          <w:szCs w:val="32"/>
-          <w:u w:val="none"/>
-        </w:rPr>
-      </w:r>
-    </w:p>
-    <w:p>
-      <w:pPr>
-        <w:pStyle w:val="Normal"/>
-        <w:spacing w:before="0" w:after="15"/>
-        <w:jc w:val="center"/>
-        <w:rPr>
-          <w:rFonts w:ascii="Times New Roman" w:hAnsi="Times New Roman"/>
-        </w:rPr>
-      </w:pPr>
-      <w:r>
-        <w:rPr>
-          <w:rFonts w:ascii="Times New Roman" w:hAnsi="Times New Roman"/>
-          <w:b/>
-          <w:bCs/>
-          <w:i w:val="false"/>
-          <w:iCs w:val="false"/>
-          <w:color w:val="213965"/>
-          <w:sz w:val="32"/>
-          <w:szCs w:val="32"/>
-          <w:u w:val="none"/>
-        </w:rPr>
-      </w:r>
-    </w:p>
-    <w:p>
-      <w:pPr>
-        <w:pStyle w:val="Normal"/>
-        <w:spacing w:before="0" w:after="15"/>
-        <w:jc w:val="center"/>
-        <w:rPr>
-          <w:rFonts w:ascii="Times New Roman" w:hAnsi="Times New Roman"/>
-        </w:rPr>
-      </w:pPr>
-      <w:r>
-        <w:rPr>
-          <w:rFonts w:ascii="Times New Roman" w:hAnsi="Times New Roman"/>
-          <w:b/>
-          <w:bCs/>
-          <w:i w:val="false"/>
-          <w:iCs w:val="false"/>
-          <w:color w:val="213965"/>
-          <w:sz w:val="32"/>
-          <w:szCs w:val="32"/>
-          <w:u w:val="none"/>
-        </w:rPr>
-      </w:r>
-    </w:p>
-    <w:p>
-      <w:pPr>
-        <w:pStyle w:val="Normal"/>
-        <w:spacing w:before="0" w:after="15"/>
-        <w:jc w:val="center"/>
-        <w:rPr>
-          <w:rFonts w:ascii="Times New Roman" w:hAnsi="Times New Roman"/>
-        </w:rPr>
-      </w:pPr>
-      <w:r>
-        <w:rPr>
-          <w:rFonts w:ascii="Times New Roman" w:hAnsi="Times New Roman"/>
-          <w:b/>
-          <w:bCs/>
-          <w:i w:val="false"/>
-          <w:iCs w:val="false"/>
-          <w:color w:val="213965"/>
-          <w:sz w:val="32"/>
-          <w:szCs w:val="32"/>
-          <w:u w:val="none"/>
-        </w:rPr>
-      </w:r>
-    </w:p>
-    <w:p>
-      <w:pPr>
-        <w:pStyle w:val="Normal"/>
-        <w:spacing w:before="0" w:after="15"/>
-        <w:jc w:val="center"/>
-        <w:rPr>
-          <w:rFonts w:ascii="Times New Roman" w:hAnsi="Times New Roman"/>
-        </w:rPr>
-      </w:pPr>
-      <w:r>
-        <w:rPr>
-          <w:rFonts w:ascii="Times New Roman" w:hAnsi="Times New Roman"/>
-          <w:b/>
-          <w:bCs/>
-          <w:i w:val="false"/>
-          <w:iCs w:val="false"/>
-          <w:color w:val="213965"/>
-          <w:sz w:val="32"/>
-          <w:szCs w:val="32"/>
-          <w:u w:val="none"/>
-        </w:rPr>
-        <w:t xml:space="preserve">End of </w:t>
-      </w:r>
-      <w:r>
-        <w:rPr>
-          <w:rFonts w:ascii="Times New Roman" w:hAnsi="Times New Roman"/>
-          <w:b/>
-          <w:bCs/>
-          <w:i w:val="false"/>
-          <w:iCs w:val="false"/>
-          <w:color w:val="213965"/>
-          <w:sz w:val="32"/>
-          <w:szCs w:val="32"/>
-          <w:u w:val="none"/>
-        </w:rPr>
-        <w:t>T</w:t>
-      </w:r>
-      <w:r>
-        <w:rPr>
-          <w:rFonts w:ascii="Times New Roman" w:hAnsi="Times New Roman"/>
-          <w:b/>
-          <w:bCs/>
-          <w:i w:val="false"/>
-          <w:iCs w:val="false"/>
-          <w:color w:val="213965"/>
-          <w:sz w:val="32"/>
-          <w:szCs w:val="32"/>
-          <w:u w:val="none"/>
-        </w:rPr>
-        <w:t>h</w:t>
-      </w:r>
-      <w:r>
-        <w:rPr>
-          <w:rFonts w:ascii="Times New Roman" w:hAnsi="Times New Roman"/>
-          <w:b/>
-          <w:bCs/>
-          <w:i w:val="false"/>
-          <w:iCs w:val="false"/>
-          <w:color w:val="213965"/>
-          <w:sz w:val="32"/>
-          <w:szCs w:val="32"/>
-          <w:u w:val="none"/>
-        </w:rPr>
-        <w:t xml:space="preserve">e </w:t>
-      </w:r>
-      <w:r>
-        <w:rPr>
-          <w:rFonts w:ascii="Times New Roman" w:hAnsi="Times New Roman"/>
-          <w:b/>
-          <w:bCs/>
-          <w:i w:val="false"/>
-          <w:iCs w:val="false"/>
-          <w:color w:val="213965"/>
-          <w:sz w:val="32"/>
-          <w:szCs w:val="32"/>
-          <w:u w:val="none"/>
-        </w:rPr>
-        <w:t>Project</w:t>
+        <w:t>End of The Project</w:t>
       </w:r>
     </w:p>
     <w:p>
@@ -42583,15 +42487,15 @@
       <w:u w:val="single"/>
     </w:rPr>
   </w:style>
-  <w:style w:type="character" w:styleId="FootnoteCharacters">
-    <w:name w:val="Footnote Characters"/>
+  <w:style w:type="character" w:styleId="FootnoteCharactersuser">
+    <w:name w:val="Footnote Characters (user)"/>
     <w:qFormat/>
     <w:rPr>
       <w:vertAlign w:val="superscript"/>
     </w:rPr>
   </w:style>
-  <w:style w:type="character" w:styleId="FootnoteCharactersuser">
-    <w:name w:val="Footnote Characters (user)"/>
+  <w:style w:type="character" w:styleId="FootnoteCharacters">
+    <w:name w:val="Footnote Characters"/>
     <w:qFormat/>
     <w:rPr>
       <w:vertAlign w:val="superscript"/>
@@ -42615,15 +42519,15 @@
       <w:szCs w:val="20"/>
     </w:rPr>
   </w:style>
-  <w:style w:type="character" w:styleId="EndnoteCharacters">
-    <w:name w:val="Endnote Characters"/>
+  <w:style w:type="character" w:styleId="EndnoteCharactersuser">
+    <w:name w:val="Endnote Characters (user)"/>
     <w:qFormat/>
     <w:rPr>
       <w:vertAlign w:val="superscript"/>
     </w:rPr>
   </w:style>
-  <w:style w:type="character" w:styleId="EndnoteCharactersuser">
-    <w:name w:val="Endnote Characters (user)"/>
+  <w:style w:type="character" w:styleId="EndnoteCharacters">
+    <w:name w:val="Endnote Characters"/>
     <w:qFormat/>
     <w:rPr>
       <w:vertAlign w:val="superscript"/>
@@ -42695,8 +42599,8 @@
       <w:rFonts w:ascii="Liberation Mono" w:hAnsi="Liberation Mono" w:eastAsia="NSimSun" w:cs="Liberation Mono"/>
     </w:rPr>
   </w:style>
-  <w:style w:type="character" w:styleId="CaptionCharacters">
-    <w:name w:val="Caption Characters"/>
+  <w:style w:type="character" w:styleId="CaptionCharactersuser">
+    <w:name w:val="Caption Characters (user)"/>
     <w:qFormat/>
     <w:rPr/>
   </w:style>
@@ -42731,8 +42635,8 @@
     <w:name w:val="page number"/>
     <w:rPr/>
   </w:style>
-  <w:style w:type="character" w:styleId="MainIndexEntry">
-    <w:name w:val="Main Index Entry"/>
+  <w:style w:type="character" w:styleId="MainIndexEntryuser">
+    <w:name w:val="Main Index Entry (user)"/>
     <w:qFormat/>
     <w:rPr>
       <w:b/>
@@ -42750,8 +42654,8 @@
     <w:name w:val="line number"/>
     <w:rPr/>
   </w:style>
-  <w:style w:type="character" w:styleId="Bullets">
-    <w:name w:val="Bullets"/>
+  <w:style w:type="character" w:styleId="Bulletsuser">
+    <w:name w:val="Bullets (user)"/>
     <w:qFormat/>
     <w:rPr>
       <w:rFonts w:ascii="OpenSymbol" w:hAnsi="OpenSymbol" w:eastAsia="OpenSymbol" w:cs="OpenSymbol"/>
@@ -42762,8 +42666,8 @@
     <w:qFormat/>
     <w:rPr/>
   </w:style>
-  <w:style w:type="character" w:styleId="Bulletsuser">
-    <w:name w:val="Bullets (user)"/>
+  <w:style w:type="character" w:styleId="Bullets">
+    <w:name w:val="Bullets"/>
     <w:qFormat/>
     <w:rPr>
       <w:rFonts w:ascii="OpenSymbol" w:hAnsi="OpenSymbol" w:eastAsia="OpenSymbol" w:cs="OpenSymbol"/>
@@ -43115,8 +43019,8 @@
     </w:pPr>
     <w:rPr/>
   </w:style>
-  <w:style w:type="paragraph" w:styleId="FrameContents">
-    <w:name w:val="Frame Contents"/>
+  <w:style w:type="paragraph" w:styleId="FrameContentsuser">
+    <w:name w:val="Frame Contents (user)"/>
     <w:basedOn w:val="Normal"/>
     <w:qFormat/>
     <w:pPr/>
@@ -43209,8 +43113,8 @@
       <w:szCs w:val="32"/>
     </w:rPr>
   </w:style>
-  <w:style w:type="paragraph" w:styleId="ObjectIndexHeading">
-    <w:name w:val="Object Index Heading"/>
+  <w:style w:type="paragraph" w:styleId="ObjectIndexHeadinguser">
+    <w:name w:val="Object Index Heading (user)"/>
     <w:basedOn w:val="IndexHeading"/>
     <w:qFormat/>
     <w:pPr>
@@ -43224,8 +43128,8 @@
       <w:szCs w:val="32"/>
     </w:rPr>
   </w:style>
-  <w:style w:type="paragraph" w:styleId="TableIndexHeading">
-    <w:name w:val="Table Index Heading"/>
+  <w:style w:type="paragraph" w:styleId="TableIndexHeadinguser">
+    <w:name w:val="Table Index Heading (user)"/>
     <w:basedOn w:val="IndexHeading"/>
     <w:qFormat/>
     <w:pPr>
@@ -43267,8 +43171,8 @@
     <w:pPr/>
     <w:rPr/>
   </w:style>
-  <w:style w:type="paragraph" w:styleId="HeaderLeft">
-    <w:name w:val="Header Left"/>
+  <w:style w:type="paragraph" w:styleId="HeaderLeftuser">
+    <w:name w:val="Header Left (user)"/>
     <w:basedOn w:val="Header"/>
     <w:qFormat/>
     <w:pPr>
@@ -43282,8 +43186,8 @@
     </w:pPr>
     <w:rPr/>
   </w:style>
-  <w:style w:type="paragraph" w:styleId="HeaderRight">
-    <w:name w:val="Header Right"/>
+  <w:style w:type="paragraph" w:styleId="HeaderRightuser">
+    <w:name w:val="Header Right (user)"/>
     <w:basedOn w:val="Header"/>
     <w:qFormat/>
     <w:pPr>
@@ -43297,8 +43201,8 @@
     </w:pPr>
     <w:rPr/>
   </w:style>
-  <w:style w:type="paragraph" w:styleId="FooterRight">
-    <w:name w:val="Footer Right"/>
+  <w:style w:type="paragraph" w:styleId="FooterRightuser">
+    <w:name w:val="Footer Right (user)"/>
     <w:basedOn w:val="Footer"/>
     <w:qFormat/>
     <w:pPr>
@@ -43312,8 +43216,8 @@
     </w:pPr>
     <w:rPr/>
   </w:style>
-  <w:style w:type="paragraph" w:styleId="FooterLeft">
-    <w:name w:val="Footer Left"/>
+  <w:style w:type="paragraph" w:styleId="FooterLeftuser">
+    <w:name w:val="Footer Left (user)"/>
     <w:basedOn w:val="Footer"/>
     <w:qFormat/>
     <w:pPr>
@@ -43334,8 +43238,8 @@
     <w:pPr/>
     <w:rPr/>
   </w:style>
-  <w:style w:type="paragraph" w:styleId="TableIndex1">
-    <w:name w:val="Table Index 1"/>
+  <w:style w:type="paragraph" w:styleId="TableIndex1user">
+    <w:name w:val="Table Index 1 (user)"/>
     <w:basedOn w:val="Index"/>
     <w:qFormat/>
     <w:pPr>
@@ -43587,8 +43491,8 @@
     </w:pPr>
     <w:rPr/>
   </w:style>
-  <w:style w:type="paragraph" w:styleId="ObjectIndex1">
-    <w:name w:val="Object Index 1"/>
+  <w:style w:type="paragraph" w:styleId="ObjectIndex1user">
+    <w:name w:val="Object Index 1 (user)"/>
     <w:basedOn w:val="Index"/>
     <w:qFormat/>
     <w:pPr>
@@ -44079,8 +43983,8 @@
     </w:pPr>
     <w:rPr/>
   </w:style>
-  <w:style w:type="paragraph" w:styleId="HangingIndent">
-    <w:name w:val="Hanging Indent"/>
+  <w:style w:type="paragraph" w:styleId="HangingIndentuser">
+    <w:name w:val="Hanging Indent (user)"/>
     <w:basedOn w:val="BodyText"/>
     <w:qFormat/>
     <w:pPr>

</xml_diff>